<commit_message>
SG3: Artifacts all artifacts again
</commit_message>
<xml_diff>
--- a/SG3_Devices/SG3_Artifacts/SG3_Design.docx
+++ b/SG3_Devices/SG3_Artifacts/SG3_Design.docx
@@ -61,7 +61,7 @@
     </w:p>
     <w:sdt>
       <w:sdtPr>
-        <w:id w:val="1120229283"/>
+        <w:id w:val="-795014601"/>
         <w:docPartObj>
           <w:docPartGallery w:val="Table of Contents"/>
           <w:docPartUnique w:val="1"/>
@@ -1653,20 +1653,9 @@
           </w:tcPr>
           <w:p>
             <w:pPr>
-              <w:keepNext w:val="0"/>
               <w:keepLines w:val="1"/>
               <w:widowControl w:val="0"/>
-              <w:pBdr>
-                <w:top w:space="0" w:sz="0" w:val="nil"/>
-                <w:left w:space="0" w:sz="0" w:val="nil"/>
-                <w:bottom w:space="0" w:sz="0" w:val="nil"/>
-                <w:right w:space="0" w:sz="0" w:val="nil"/>
-                <w:between w:space="0" w:sz="0" w:val="nil"/>
-              </w:pBdr>
-              <w:shd w:fill="auto" w:val="clear"/>
-              <w:spacing w:after="120" w:before="0" w:line="360" w:lineRule="auto"/>
-              <w:ind w:left="0" w:right="0" w:firstLine="0"/>
-              <w:jc w:val="left"/>
+              <w:spacing w:after="120" w:lineRule="auto"/>
               <w:rPr>
                 <w:sz w:val="20"/>
                 <w:szCs w:val="20"/>
@@ -1678,9 +1667,44 @@
                 <w:szCs w:val="20"/>
                 <w:rtl w:val="0"/>
               </w:rPr>
-              <w:t xml:space="preserve">Mustafa Al-Bayati</w:t>
+              <w:t xml:space="preserve">Mustafa Al-Bayati, Ryad Hazin, Tony Nguyen, Sergej Macut</w:t>
             </w:r>
           </w:p>
+        </w:tc>
+      </w:tr>
+      <w:tr>
+        <w:trPr>
+          <w:cantSplit w:val="0"/>
+          <w:tblHeader w:val="0"/>
+        </w:trPr>
+        <w:tc>
+          <w:tcPr>
+            <w:vAlign w:val="top"/>
+          </w:tcPr>
+          <w:p>
+            <w:pPr>
+              <w:keepLines w:val="1"/>
+              <w:widowControl w:val="0"/>
+              <w:spacing w:after="120" w:line="360" w:lineRule="auto"/>
+              <w:rPr>
+                <w:sz w:val="20"/>
+                <w:szCs w:val="20"/>
+              </w:rPr>
+            </w:pPr>
+            <w:r>
+              <w:rPr>
+                <w:sz w:val="20"/>
+                <w:szCs w:val="20"/>
+                <w:rtl w:val="0"/>
+              </w:rPr>
+              <w:t xml:space="preserve">2026-05-08</w:t>
+            </w:r>
+          </w:p>
+        </w:tc>
+        <w:tc>
+          <w:tcPr>
+            <w:vAlign w:val="top"/>
+          </w:tcPr>
           <w:p>
             <w:pPr>
               <w:keepNext w:val="0"/>
@@ -1708,28 +1732,14 @@
                 <w:szCs w:val="20"/>
                 <w:rtl w:val="0"/>
               </w:rPr>
-              <w:t xml:space="preserve">Ryad Hazin</w:t>
+              <w:t xml:space="preserve">1.4</w:t>
             </w:r>
           </w:p>
-          <w:p>
-            <w:pPr>
-              <w:keepLines w:val="1"/>
-              <w:widowControl w:val="0"/>
-              <w:spacing w:after="120" w:lineRule="auto"/>
-              <w:rPr>
-                <w:sz w:val="20"/>
-                <w:szCs w:val="20"/>
-              </w:rPr>
-            </w:pPr>
-            <w:r>
-              <w:rPr>
-                <w:sz w:val="20"/>
-                <w:szCs w:val="20"/>
-                <w:rtl w:val="0"/>
-              </w:rPr>
-              <w:t xml:space="preserve">Tony Nguyen</w:t>
-            </w:r>
-          </w:p>
+        </w:tc>
+        <w:tc>
+          <w:tcPr>
+            <w:vAlign w:val="top"/>
+          </w:tcPr>
           <w:p>
             <w:pPr>
               <w:keepNext w:val="0"/>
@@ -1757,7 +1767,31 @@
                 <w:szCs w:val="20"/>
                 <w:rtl w:val="0"/>
               </w:rPr>
-              <w:t xml:space="preserve">Sergej Macut</w:t>
+              <w:t xml:space="preserve">Updated file to contain Table of content.</w:t>
+            </w:r>
+          </w:p>
+        </w:tc>
+        <w:tc>
+          <w:tcPr>
+            <w:vAlign w:val="top"/>
+          </w:tcPr>
+          <w:p>
+            <w:pPr>
+              <w:keepLines w:val="1"/>
+              <w:widowControl w:val="0"/>
+              <w:spacing w:after="120" w:lineRule="auto"/>
+              <w:rPr>
+                <w:sz w:val="20"/>
+                <w:szCs w:val="20"/>
+              </w:rPr>
+            </w:pPr>
+            <w:r>
+              <w:rPr>
+                <w:sz w:val="20"/>
+                <w:szCs w:val="20"/>
+                <w:rtl w:val="0"/>
+              </w:rPr>
+              <w:t xml:space="preserve">Mustafa Al-Bayati, Ryad Hazin, Tony Nguyen, Sergej Macut</w:t>
             </w:r>
           </w:p>
         </w:tc>
@@ -2560,7 +2594,7 @@
       <w:bookmarkEnd w:id="4"/>
       <w:sdt>
         <w:sdtPr>
-          <w:id w:val="1045847880"/>
+          <w:id w:val="-1609733431"/>
           <w:tag w:val="goog_rdk_0"/>
         </w:sdtPr>
         <w:sdtContent>
@@ -2826,12 +2860,12 @@
           <wp:inline distB="0" distT="0" distL="114300" distR="114300">
             <wp:extent cx="5638800" cy="3752850"/>
             <wp:effectExtent b="0" l="0" r="0" t="0"/>
-            <wp:docPr id="1" name="image5.png"/>
+            <wp:docPr id="1" name="image2.png"/>
             <a:graphic>
               <a:graphicData uri="http://schemas.openxmlformats.org/drawingml/2006/picture">
                 <pic:pic>
                   <pic:nvPicPr>
-                    <pic:cNvPr id="0" name="image5.png"/>
+                    <pic:cNvPr id="0" name="image2.png"/>
                     <pic:cNvPicPr preferRelativeResize="0"/>
                   </pic:nvPicPr>
                   <pic:blipFill>
@@ -3909,12 +3943,12 @@
           <wp:inline distB="114300" distT="114300" distL="114300" distR="114300">
             <wp:extent cx="4992581" cy="4091526"/>
             <wp:effectExtent b="0" l="0" r="0" t="0"/>
-            <wp:docPr id="2" name="image1.png"/>
+            <wp:docPr id="2" name="image3.png"/>
             <a:graphic>
               <a:graphicData uri="http://schemas.openxmlformats.org/drawingml/2006/picture">
                 <pic:pic>
                   <pic:nvPicPr>
-                    <pic:cNvPr id="0" name="image1.png"/>
+                    <pic:cNvPr id="0" name="image3.png"/>
                     <pic:cNvPicPr preferRelativeResize="0"/>
                   </pic:nvPicPr>
                   <pic:blipFill>
@@ -4450,12 +4484,12 @@
           <wp:inline distB="0" distT="0" distL="114300" distR="114300">
             <wp:extent cx="4895850" cy="3295650"/>
             <wp:effectExtent b="0" l="0" r="0" t="0"/>
-            <wp:docPr id="5" name="image2.png"/>
+            <wp:docPr id="5" name="image5.png"/>
             <a:graphic>
               <a:graphicData uri="http://schemas.openxmlformats.org/drawingml/2006/picture">
                 <pic:pic>
                   <pic:nvPicPr>
-                    <pic:cNvPr id="0" name="image2.png"/>
+                    <pic:cNvPr id="0" name="image5.png"/>
                     <pic:cNvPicPr preferRelativeResize="0"/>
                   </pic:nvPicPr>
                   <pic:blipFill>
@@ -4608,12 +4642,12 @@
           <wp:inline distB="0" distT="0" distL="114300" distR="114300">
             <wp:extent cx="5763895" cy="2492375"/>
             <wp:effectExtent b="0" l="0" r="0" t="0"/>
-            <wp:docPr id="4" name="image3.png"/>
+            <wp:docPr id="4" name="image1.png"/>
             <a:graphic>
               <a:graphicData uri="http://schemas.openxmlformats.org/drawingml/2006/picture">
                 <pic:pic>
                   <pic:nvPicPr>
-                    <pic:cNvPr id="0" name="image3.png"/>
+                    <pic:cNvPr id="0" name="image1.png"/>
                     <pic:cNvPicPr preferRelativeResize="0"/>
                   </pic:nvPicPr>
                   <pic:blipFill>

</xml_diff>